<commit_message>
tambahkan template surat dan sesuaikan field import dengan kolom BIP
</commit_message>
<xml_diff>
--- a/database/templates/sktm.docx
+++ b/database/templates/sktm.docx
@@ -2,89 +2,183 @@
 <file path=word/document.xml><?xml version="1.0" encoding="utf-8"?>
 <w:document xmlns:wpc="http://schemas.microsoft.com/office/word/2010/wordprocessingCanvas" xmlns:mo="http://schemas.microsoft.com/office/mac/office/2008/main" xmlns:mc="http://schemas.openxmlformats.org/markup-compatibility/2006" xmlns:mv="urn:schemas-microsoft-com:mac:vml" xmlns:o="urn:schemas-microsoft-com:office:office" xmlns:r="http://schemas.openxmlformats.org/officeDocument/2006/relationships" xmlns:m="http://schemas.openxmlformats.org/officeDocument/2006/math" xmlns:v="urn:schemas-microsoft-com:vml" xmlns:wp14="http://schemas.microsoft.com/office/word/2010/wordprocessingDrawing" xmlns:wp="http://schemas.openxmlformats.org/drawingml/2006/wordprocessingDrawing" xmlns:w10="urn:schemas-microsoft-com:office:word" xmlns:w="http://schemas.openxmlformats.org/wordprocessingml/2006/main" xmlns:w14="http://schemas.microsoft.com/office/word/2010/wordml" xmlns:wpg="http://schemas.microsoft.com/office/word/2010/wordprocessingGroup" xmlns:wpi="http://schemas.microsoft.com/office/word/2010/wordprocessingInk" xmlns:wne="http://schemas.microsoft.com/office/word/2006/wordml" xmlns:wps="http://schemas.microsoft.com/office/word/2010/wordprocessingShape" mc:Ignorable="w14 wp14">
   <w:body>
+    <w:tbl>
+      <w:tblPr>
+        <w:tblW w:type="auto" w:w="0"/>
+        <w:jc w:val="center"/>
+        <w:tblLook w:firstColumn="1" w:firstRow="1" w:lastColumn="0" w:lastRow="0" w:noHBand="0" w:noVBand="1" w:val="04A0"/>
+        <w:tblBorders>
+          <w:top w:val="none"/>
+          <w:left w:val="none"/>
+          <w:bottom w:val="none"/>
+          <w:right w:val="none"/>
+          <w:insideH w:val="none"/>
+          <w:insideV w:val="none"/>
+        </w:tblBorders>
+        <w:tblCellMar>
+          <w:top w:w="0" w:type="dxa"/>
+          <w:bottom w:w="0" w:type="dxa"/>
+          <w:left w:w="0" w:type="dxa"/>
+          <w:right w:w="80" w:type="dxa"/>
+        </w:tblCellMar>
+        <w:tblCellSpacing w:w="0" w:type="dxa"/>
+      </w:tblPr>
+      <w:tblGrid>
+        <w:gridCol w:w="1531"/>
+        <w:gridCol w:w="6917"/>
+        <w:gridCol w:w="1247"/>
+      </w:tblGrid>
+      <w:tr>
+        <w:tc>
+          <w:tcPr>
+            <w:tcW w:type="dxa" w:w="1531"/>
+          </w:tcPr>
+          <w:p>
+            <w:pPr>
+              <w:jc w:val="center"/>
+            </w:pPr>
+            <w:r>
+              <w:drawing>
+                <wp:inline xmlns:a="http://schemas.openxmlformats.org/drawingml/2006/main" xmlns:pic="http://schemas.openxmlformats.org/drawingml/2006/picture">
+                  <wp:extent cx="864000" cy="821077"/>
+                  <wp:docPr id="1" name="Picture 1"/>
+                  <wp:cNvGraphicFramePr>
+                    <a:graphicFrameLocks noChangeAspect="1"/>
+                  </wp:cNvGraphicFramePr>
+                  <a:graphic>
+                    <a:graphicData uri="http://schemas.openxmlformats.org/drawingml/2006/picture">
+                      <pic:pic>
+                        <pic:nvPicPr>
+                          <pic:cNvPr id="0" name="logo_blitar.png"/>
+                          <pic:cNvPicPr/>
+                        </pic:nvPicPr>
+                        <pic:blipFill>
+                          <a:blip r:embed="rId9"/>
+                          <a:stretch>
+                            <a:fillRect/>
+                          </a:stretch>
+                        </pic:blipFill>
+                        <pic:spPr>
+                          <a:xfrm>
+                            <a:off x="0" y="0"/>
+                            <a:ext cx="864000" cy="821077"/>
+                          </a:xfrm>
+                          <a:prstGeom prst="rect"/>
+                        </pic:spPr>
+                      </pic:pic>
+                    </a:graphicData>
+                  </a:graphic>
+                </wp:inline>
+              </w:drawing>
+            </w:r>
+          </w:p>
+        </w:tc>
+        <w:tc>
+          <w:tcPr>
+            <w:tcW w:type="dxa" w:w="6917"/>
+          </w:tcPr>
+          <w:p>
+            <w:pPr>
+              <w:spacing w:after="0" w:before="0"/>
+              <w:jc w:val="center"/>
+            </w:pPr>
+            <w:r>
+              <w:rPr>
+                <w:rFonts w:ascii="Tahoma" w:hAnsi="Tahoma" w:cs="Tahoma"/>
+                <w:b w:val="0"/>
+                <w:sz w:val="28"/>
+                <w:u w:val="none"/>
+              </w:rPr>
+              <w:t>PEMERINTAH KABUPATEN BLITAR</w:t>
+            </w:r>
+          </w:p>
+          <w:p>
+            <w:pPr>
+              <w:spacing w:after="0" w:before="0"/>
+              <w:jc w:val="center"/>
+            </w:pPr>
+            <w:r>
+              <w:rPr>
+                <w:rFonts w:ascii="Tahoma" w:hAnsi="Tahoma" w:cs="Tahoma"/>
+                <w:b w:val="0"/>
+                <w:sz w:val="28"/>
+                <w:u w:val="none"/>
+              </w:rPr>
+              <w:t>KECAMATAN BINANGUN</w:t>
+            </w:r>
+          </w:p>
+          <w:p>
+            <w:pPr>
+              <w:spacing w:after="0" w:before="0"/>
+              <w:jc w:val="center"/>
+            </w:pPr>
+            <w:r>
+              <w:rPr>
+                <w:rFonts w:ascii="Tahoma" w:hAnsi="Tahoma" w:cs="Tahoma"/>
+                <w:b/>
+                <w:sz w:val="36"/>
+                <w:u w:val="none"/>
+              </w:rPr>
+              <w:t>DESA NGADRI</w:t>
+            </w:r>
+          </w:p>
+          <w:p>
+            <w:pPr>
+              <w:spacing w:after="0" w:before="0"/>
+              <w:jc w:val="center"/>
+            </w:pPr>
+            <w:r>
+              <w:rPr>
+                <w:rFonts w:ascii="Tahoma" w:hAnsi="Tahoma" w:cs="Tahoma"/>
+                <w:b w:val="0"/>
+                <w:sz w:val="24"/>
+                <w:u w:val="none"/>
+              </w:rPr>
+              <w:t>Jalan Lumba-lumba No. 1 Kode Pos 66193</w:t>
+            </w:r>
+          </w:p>
+          <w:p>
+            <w:pPr>
+              <w:spacing w:after="0" w:before="0"/>
+              <w:jc w:val="center"/>
+            </w:pPr>
+            <w:r>
+              <w:rPr>
+                <w:rFonts w:ascii="Tahoma" w:hAnsi="Tahoma" w:cs="Tahoma"/>
+                <w:b w:val="0"/>
+                <w:sz w:val="22"/>
+                <w:u w:val="none"/>
+              </w:rPr>
+              <w:t>Email: pemdesngadri@gmail.com</w:t>
+            </w:r>
+          </w:p>
+        </w:tc>
+        <w:tc>
+          <w:tcPr>
+            <w:tcW w:type="dxa" w:w="1247"/>
+          </w:tcPr>
+          <w:p/>
+        </w:tc>
+      </w:tr>
+    </w:tbl>
     <w:p>
       <w:pPr>
+        <w:spacing w:after="120" w:before="0"/>
+        <w:pBdr>
+          <w:bottom w:val="single" w:sz="24" w:space="1" w:color="000000"/>
+        </w:pBdr>
+      </w:pPr>
+    </w:p>
+    <w:p>
+      <w:pPr>
+        <w:spacing w:after="0" w:before="80" w:line="240" w:lineRule="auto"/>
         <w:jc w:val="center"/>
       </w:pPr>
       <w:r>
         <w:rPr>
+          <w:rFonts w:ascii="Arial" w:hAnsi="Arial" w:cs="Arial"/>
           <w:b/>
-          <w:i w:val="0"/>
           <w:sz w:val="28"/>
-          <w:u w:val="none"/>
-        </w:rPr>
-        <w:t>PEMERINTAH KABUPATEN ${kabupaten}</w:t>
-      </w:r>
-    </w:p>
-    <w:p>
-      <w:pPr>
-        <w:jc w:val="center"/>
-      </w:pPr>
-      <w:r>
-        <w:rPr>
-          <w:b/>
-          <w:i w:val="0"/>
-          <w:sz w:val="28"/>
-          <w:u w:val="none"/>
-        </w:rPr>
-        <w:t>KECAMATAN ${kecamatan}</w:t>
-      </w:r>
-    </w:p>
-    <w:p>
-      <w:pPr>
-        <w:jc w:val="center"/>
-      </w:pPr>
-      <w:r>
-        <w:rPr>
-          <w:b/>
-          <w:i w:val="0"/>
-          <w:sz w:val="32"/>
-          <w:u w:val="none"/>
-        </w:rPr>
-        <w:t>DESA ${desa}</w:t>
-      </w:r>
-    </w:p>
-    <w:p>
-      <w:pPr>
-        <w:jc w:val="center"/>
-      </w:pPr>
-      <w:r>
-        <w:rPr>
-          <w:b w:val="0"/>
-          <w:i w:val="0"/>
-          <w:sz w:val="18"/>
-          <w:u w:val="none"/>
-        </w:rPr>
-        <w:t>Alamat: Kantor Desa  -  Kode Pos</w:t>
-      </w:r>
-    </w:p>
-    <w:p>
-      <w:pPr>
-        <w:spacing w:after="40"/>
-        <w:pBdr>
-          <w:bottom w:val="single" w:sz="18" w:space="1" w:color="000000"/>
-        </w:pBdr>
-      </w:pPr>
-    </w:p>
-    <w:p>
-      <w:r>
-        <w:rPr>
-          <w:b w:val="0"/>
-          <w:i w:val="0"/>
-          <w:sz w:val="22"/>
-          <w:u w:val="none"/>
-        </w:rPr>
-      </w:r>
-    </w:p>
-    <w:p>
-      <w:pPr>
-        <w:jc w:val="center"/>
-      </w:pPr>
-      <w:r>
-        <w:rPr>
-          <w:b/>
-          <w:i w:val="0"/>
-          <w:sz w:val="24"/>
           <w:u w:val="single"/>
         </w:rPr>
         <w:t>SURAT KETERANGAN TIDAK MAMPU</w:t>
@@ -92,67 +186,77 @@
     </w:p>
     <w:p>
       <w:pPr>
+        <w:spacing w:after="120" w:before="0" w:line="240" w:lineRule="auto"/>
         <w:jc w:val="center"/>
       </w:pPr>
       <w:r>
         <w:rPr>
+          <w:rFonts w:ascii="Arial" w:hAnsi="Arial" w:cs="Arial"/>
           <w:b w:val="0"/>
-          <w:i w:val="0"/>
-          <w:sz w:val="22"/>
+          <w:sz w:val="24"/>
           <w:u w:val="none"/>
         </w:rPr>
-        <w:t>Nomor: ${nomor_surat}</w:t>
+        <w:t>Nomor : ${nomor_surat}</w:t>
       </w:r>
     </w:p>
     <w:p>
+      <w:pPr>
+        <w:spacing w:after="80" w:before="0" w:line="240" w:lineRule="auto"/>
+        <w:jc w:val="both"/>
+      </w:pPr>
       <w:r>
         <w:rPr>
+          <w:rFonts w:ascii="Arial" w:hAnsi="Arial" w:cs="Arial"/>
           <w:b w:val="0"/>
-          <w:i w:val="0"/>
-          <w:sz w:val="22"/>
+          <w:sz w:val="24"/>
           <w:u w:val="none"/>
         </w:rPr>
-      </w:r>
-    </w:p>
-    <w:p>
-      <w:r>
-        <w:rPr>
-          <w:b w:val="0"/>
-          <w:i w:val="0"/>
-          <w:sz w:val="22"/>
-          <w:u w:val="none"/>
-        </w:rPr>
-        <w:t>Yang bertanda tangan di bawah ini, Kepala Desa ${desa}, Kecamatan ${kecamatan}, Kabupaten ${kabupaten}, dengan ini menerangkan bahwa:</w:t>
-      </w:r>
-    </w:p>
-    <w:p>
-      <w:r>
-        <w:rPr>
-          <w:b w:val="0"/>
-          <w:i w:val="0"/>
-          <w:sz w:val="22"/>
-          <w:u w:val="none"/>
-        </w:rPr>
+        <w:t>Yang bertanda tangan di bawah ini, ${jabatan_ttd} Ngadri Kecamatan Binangun Kabupaten Blitar, menerangkan bahwa :</w:t>
       </w:r>
     </w:p>
     <w:tbl>
       <w:tblPr>
         <w:tblW w:type="auto" w:w="0"/>
         <w:tblLook w:firstColumn="1" w:firstRow="1" w:lastColumn="0" w:lastRow="0" w:noHBand="0" w:noVBand="1" w:val="04A0"/>
+        <w:tblBorders>
+          <w:top w:val="none"/>
+          <w:left w:val="none"/>
+          <w:bottom w:val="none"/>
+          <w:right w:val="none"/>
+          <w:insideH w:val="none"/>
+          <w:insideV w:val="none"/>
+        </w:tblBorders>
+        <w:tblCellMar>
+          <w:top w:w="0" w:type="dxa"/>
+          <w:bottom w:w="0" w:type="dxa"/>
+          <w:left w:w="0" w:type="dxa"/>
+          <w:right w:w="80" w:type="dxa"/>
+        </w:tblCellMar>
+        <w:tblCellSpacing w:w="0" w:type="dxa"/>
       </w:tblPr>
       <w:tblGrid>
-        <w:gridCol w:w="3230"/>
-        <w:gridCol w:w="3230"/>
-        <w:gridCol w:w="3230"/>
+        <w:gridCol w:w="3267"/>
+        <w:gridCol w:w="3267"/>
+        <w:gridCol w:w="3267"/>
       </w:tblGrid>
       <w:tr>
         <w:tc>
           <w:tcPr>
-            <w:tcW w:type="dxa" w:w="2551"/>
+            <w:tcW w:type="dxa" w:w="2665"/>
           </w:tcPr>
           <w:p>
+            <w:pPr>
+              <w:spacing w:after="0" w:before="0" w:line="240" w:lineRule="auto"/>
+            </w:pPr>
+            <w:r/>
             <w:r>
-              <w:t>Nama</w:t>
+              <w:rPr>
+                <w:rFonts w:ascii="Arial" w:hAnsi="Arial" w:cs="Arial"/>
+                <w:b w:val="0"/>
+                <w:sz w:val="24"/>
+                <w:u w:val="none"/>
+              </w:rPr>
+              <w:t>Nama Lengkap</w:t>
             </w:r>
           </w:p>
         </w:tc>
@@ -161,17 +265,37 @@
             <w:tcW w:type="dxa" w:w="283"/>
           </w:tcPr>
           <w:p>
+            <w:pPr>
+              <w:spacing w:after="0" w:before="0" w:line="240" w:lineRule="auto"/>
+            </w:pPr>
+            <w:r/>
             <w:r>
+              <w:rPr>
+                <w:rFonts w:ascii="Arial" w:hAnsi="Arial" w:cs="Arial"/>
+                <w:b w:val="0"/>
+                <w:sz w:val="24"/>
+                <w:u w:val="none"/>
+              </w:rPr>
               <w:t>:</w:t>
             </w:r>
           </w:p>
         </w:tc>
         <w:tc>
           <w:tcPr>
-            <w:tcW w:type="dxa" w:w="5669"/>
+            <w:tcW w:type="dxa" w:w="6520"/>
           </w:tcPr>
           <w:p>
+            <w:pPr>
+              <w:spacing w:after="0" w:before="0" w:line="240" w:lineRule="auto"/>
+            </w:pPr>
+            <w:r/>
             <w:r>
+              <w:rPr>
+                <w:rFonts w:ascii="Arial" w:hAnsi="Arial" w:cs="Arial"/>
+                <w:b w:val="0"/>
+                <w:sz w:val="24"/>
+                <w:u w:val="none"/>
+              </w:rPr>
               <w:t>${nama}</w:t>
             </w:r>
           </w:p>
@@ -180,10 +304,20 @@
       <w:tr>
         <w:tc>
           <w:tcPr>
-            <w:tcW w:type="dxa" w:w="2551"/>
+            <w:tcW w:type="dxa" w:w="2665"/>
           </w:tcPr>
           <w:p>
+            <w:pPr>
+              <w:spacing w:after="0" w:before="0" w:line="240" w:lineRule="auto"/>
+            </w:pPr>
+            <w:r/>
             <w:r>
+              <w:rPr>
+                <w:rFonts w:ascii="Arial" w:hAnsi="Arial" w:cs="Arial"/>
+                <w:b w:val="0"/>
+                <w:sz w:val="24"/>
+                <w:u w:val="none"/>
+              </w:rPr>
               <w:t>NIK</w:t>
             </w:r>
           </w:p>
@@ -193,17 +327,37 @@
             <w:tcW w:type="dxa" w:w="283"/>
           </w:tcPr>
           <w:p>
+            <w:pPr>
+              <w:spacing w:after="0" w:before="0" w:line="240" w:lineRule="auto"/>
+            </w:pPr>
+            <w:r/>
             <w:r>
+              <w:rPr>
+                <w:rFonts w:ascii="Arial" w:hAnsi="Arial" w:cs="Arial"/>
+                <w:b w:val="0"/>
+                <w:sz w:val="24"/>
+                <w:u w:val="none"/>
+              </w:rPr>
               <w:t>:</w:t>
             </w:r>
           </w:p>
         </w:tc>
         <w:tc>
           <w:tcPr>
-            <w:tcW w:type="dxa" w:w="5669"/>
+            <w:tcW w:type="dxa" w:w="6520"/>
           </w:tcPr>
           <w:p>
+            <w:pPr>
+              <w:spacing w:after="0" w:before="0" w:line="240" w:lineRule="auto"/>
+            </w:pPr>
+            <w:r/>
             <w:r>
+              <w:rPr>
+                <w:rFonts w:ascii="Arial" w:hAnsi="Arial" w:cs="Arial"/>
+                <w:b w:val="0"/>
+                <w:sz w:val="24"/>
+                <w:u w:val="none"/>
+              </w:rPr>
               <w:t>${nik}</w:t>
             </w:r>
           </w:p>
@@ -212,11 +366,21 @@
       <w:tr>
         <w:tc>
           <w:tcPr>
-            <w:tcW w:type="dxa" w:w="2551"/>
+            <w:tcW w:type="dxa" w:w="2665"/>
           </w:tcPr>
           <w:p>
+            <w:pPr>
+              <w:spacing w:after="0" w:before="0" w:line="240" w:lineRule="auto"/>
+            </w:pPr>
+            <w:r/>
             <w:r>
-              <w:t>Tempat/Tgl Lahir</w:t>
+              <w:rPr>
+                <w:rFonts w:ascii="Arial" w:hAnsi="Arial" w:cs="Arial"/>
+                <w:b w:val="0"/>
+                <w:sz w:val="24"/>
+                <w:u w:val="none"/>
+              </w:rPr>
+              <w:t>Tempat/Tgl. Lahir</w:t>
             </w:r>
           </w:p>
         </w:tc>
@@ -225,17 +389,37 @@
             <w:tcW w:type="dxa" w:w="283"/>
           </w:tcPr>
           <w:p>
+            <w:pPr>
+              <w:spacing w:after="0" w:before="0" w:line="240" w:lineRule="auto"/>
+            </w:pPr>
+            <w:r/>
             <w:r>
+              <w:rPr>
+                <w:rFonts w:ascii="Arial" w:hAnsi="Arial" w:cs="Arial"/>
+                <w:b w:val="0"/>
+                <w:sz w:val="24"/>
+                <w:u w:val="none"/>
+              </w:rPr>
               <w:t>:</w:t>
             </w:r>
           </w:p>
         </w:tc>
         <w:tc>
           <w:tcPr>
-            <w:tcW w:type="dxa" w:w="5669"/>
+            <w:tcW w:type="dxa" w:w="6520"/>
           </w:tcPr>
           <w:p>
+            <w:pPr>
+              <w:spacing w:after="0" w:before="0" w:line="240" w:lineRule="auto"/>
+            </w:pPr>
+            <w:r/>
             <w:r>
+              <w:rPr>
+                <w:rFonts w:ascii="Arial" w:hAnsi="Arial" w:cs="Arial"/>
+                <w:b w:val="0"/>
+                <w:sz w:val="24"/>
+                <w:u w:val="none"/>
+              </w:rPr>
               <w:t>${tempat_lahir}, ${tanggal_lahir}</w:t>
             </w:r>
           </w:p>
@@ -244,10 +428,20 @@
       <w:tr>
         <w:tc>
           <w:tcPr>
-            <w:tcW w:type="dxa" w:w="2551"/>
+            <w:tcW w:type="dxa" w:w="2665"/>
           </w:tcPr>
           <w:p>
+            <w:pPr>
+              <w:spacing w:after="0" w:before="0" w:line="240" w:lineRule="auto"/>
+            </w:pPr>
+            <w:r/>
             <w:r>
+              <w:rPr>
+                <w:rFonts w:ascii="Arial" w:hAnsi="Arial" w:cs="Arial"/>
+                <w:b w:val="0"/>
+                <w:sz w:val="24"/>
+                <w:u w:val="none"/>
+              </w:rPr>
               <w:t>Jenis Kelamin</w:t>
             </w:r>
           </w:p>
@@ -257,17 +451,37 @@
             <w:tcW w:type="dxa" w:w="283"/>
           </w:tcPr>
           <w:p>
+            <w:pPr>
+              <w:spacing w:after="0" w:before="0" w:line="240" w:lineRule="auto"/>
+            </w:pPr>
+            <w:r/>
             <w:r>
+              <w:rPr>
+                <w:rFonts w:ascii="Arial" w:hAnsi="Arial" w:cs="Arial"/>
+                <w:b w:val="0"/>
+                <w:sz w:val="24"/>
+                <w:u w:val="none"/>
+              </w:rPr>
               <w:t>:</w:t>
             </w:r>
           </w:p>
         </w:tc>
         <w:tc>
           <w:tcPr>
-            <w:tcW w:type="dxa" w:w="5669"/>
+            <w:tcW w:type="dxa" w:w="6520"/>
           </w:tcPr>
           <w:p>
+            <w:pPr>
+              <w:spacing w:after="0" w:before="0" w:line="240" w:lineRule="auto"/>
+            </w:pPr>
+            <w:r/>
             <w:r>
+              <w:rPr>
+                <w:rFonts w:ascii="Arial" w:hAnsi="Arial" w:cs="Arial"/>
+                <w:b w:val="0"/>
+                <w:sz w:val="24"/>
+                <w:u w:val="none"/>
+              </w:rPr>
               <w:t>${jenis_kelamin}</w:t>
             </w:r>
           </w:p>
@@ -276,10 +490,20 @@
       <w:tr>
         <w:tc>
           <w:tcPr>
-            <w:tcW w:type="dxa" w:w="2551"/>
+            <w:tcW w:type="dxa" w:w="2665"/>
           </w:tcPr>
           <w:p>
+            <w:pPr>
+              <w:spacing w:after="0" w:before="0" w:line="240" w:lineRule="auto"/>
+            </w:pPr>
+            <w:r/>
             <w:r>
+              <w:rPr>
+                <w:rFonts w:ascii="Arial" w:hAnsi="Arial" w:cs="Arial"/>
+                <w:b w:val="0"/>
+                <w:sz w:val="24"/>
+                <w:u w:val="none"/>
+              </w:rPr>
               <w:t>Agama</w:t>
             </w:r>
           </w:p>
@@ -289,17 +513,37 @@
             <w:tcW w:type="dxa" w:w="283"/>
           </w:tcPr>
           <w:p>
+            <w:pPr>
+              <w:spacing w:after="0" w:before="0" w:line="240" w:lineRule="auto"/>
+            </w:pPr>
+            <w:r/>
             <w:r>
+              <w:rPr>
+                <w:rFonts w:ascii="Arial" w:hAnsi="Arial" w:cs="Arial"/>
+                <w:b w:val="0"/>
+                <w:sz w:val="24"/>
+                <w:u w:val="none"/>
+              </w:rPr>
               <w:t>:</w:t>
             </w:r>
           </w:p>
         </w:tc>
         <w:tc>
           <w:tcPr>
-            <w:tcW w:type="dxa" w:w="5669"/>
+            <w:tcW w:type="dxa" w:w="6520"/>
           </w:tcPr>
           <w:p>
+            <w:pPr>
+              <w:spacing w:after="0" w:before="0" w:line="240" w:lineRule="auto"/>
+            </w:pPr>
+            <w:r/>
             <w:r>
+              <w:rPr>
+                <w:rFonts w:ascii="Arial" w:hAnsi="Arial" w:cs="Arial"/>
+                <w:b w:val="0"/>
+                <w:sz w:val="24"/>
+                <w:u w:val="none"/>
+              </w:rPr>
               <w:t>${agama}</w:t>
             </w:r>
           </w:p>
@@ -308,10 +552,20 @@
       <w:tr>
         <w:tc>
           <w:tcPr>
-            <w:tcW w:type="dxa" w:w="2551"/>
+            <w:tcW w:type="dxa" w:w="2665"/>
           </w:tcPr>
           <w:p>
+            <w:pPr>
+              <w:spacing w:after="0" w:before="0" w:line="240" w:lineRule="auto"/>
+            </w:pPr>
+            <w:r/>
             <w:r>
+              <w:rPr>
+                <w:rFonts w:ascii="Arial" w:hAnsi="Arial" w:cs="Arial"/>
+                <w:b w:val="0"/>
+                <w:sz w:val="24"/>
+                <w:u w:val="none"/>
+              </w:rPr>
               <w:t>Pekerjaan</w:t>
             </w:r>
           </w:p>
@@ -321,17 +575,37 @@
             <w:tcW w:type="dxa" w:w="283"/>
           </w:tcPr>
           <w:p>
+            <w:pPr>
+              <w:spacing w:after="0" w:before="0" w:line="240" w:lineRule="auto"/>
+            </w:pPr>
+            <w:r/>
             <w:r>
+              <w:rPr>
+                <w:rFonts w:ascii="Arial" w:hAnsi="Arial" w:cs="Arial"/>
+                <w:b w:val="0"/>
+                <w:sz w:val="24"/>
+                <w:u w:val="none"/>
+              </w:rPr>
               <w:t>:</w:t>
             </w:r>
           </w:p>
         </w:tc>
         <w:tc>
           <w:tcPr>
-            <w:tcW w:type="dxa" w:w="5669"/>
+            <w:tcW w:type="dxa" w:w="6520"/>
           </w:tcPr>
           <w:p>
+            <w:pPr>
+              <w:spacing w:after="0" w:before="0" w:line="240" w:lineRule="auto"/>
+            </w:pPr>
+            <w:r/>
             <w:r>
+              <w:rPr>
+                <w:rFonts w:ascii="Arial" w:hAnsi="Arial" w:cs="Arial"/>
+                <w:b w:val="0"/>
+                <w:sz w:val="24"/>
+                <w:u w:val="none"/>
+              </w:rPr>
               <w:t>${pekerjaan}</w:t>
             </w:r>
           </w:p>
@@ -340,10 +614,82 @@
       <w:tr>
         <w:tc>
           <w:tcPr>
-            <w:tcW w:type="dxa" w:w="2551"/>
+            <w:tcW w:type="dxa" w:w="2665"/>
           </w:tcPr>
           <w:p>
+            <w:pPr>
+              <w:spacing w:after="0" w:before="0" w:line="240" w:lineRule="auto"/>
+            </w:pPr>
+            <w:r/>
             <w:r>
+              <w:rPr>
+                <w:rFonts w:ascii="Arial" w:hAnsi="Arial" w:cs="Arial"/>
+                <w:b w:val="0"/>
+                <w:sz w:val="24"/>
+                <w:u w:val="none"/>
+              </w:rPr>
+              <w:t>Status Perkawinan</w:t>
+            </w:r>
+          </w:p>
+        </w:tc>
+        <w:tc>
+          <w:tcPr>
+            <w:tcW w:type="dxa" w:w="283"/>
+          </w:tcPr>
+          <w:p>
+            <w:pPr>
+              <w:spacing w:after="0" w:before="0" w:line="240" w:lineRule="auto"/>
+            </w:pPr>
+            <w:r/>
+            <w:r>
+              <w:rPr>
+                <w:rFonts w:ascii="Arial" w:hAnsi="Arial" w:cs="Arial"/>
+                <w:b w:val="0"/>
+                <w:sz w:val="24"/>
+                <w:u w:val="none"/>
+              </w:rPr>
+              <w:t>:</w:t>
+            </w:r>
+          </w:p>
+        </w:tc>
+        <w:tc>
+          <w:tcPr>
+            <w:tcW w:type="dxa" w:w="6520"/>
+          </w:tcPr>
+          <w:p>
+            <w:pPr>
+              <w:spacing w:after="0" w:before="0" w:line="240" w:lineRule="auto"/>
+            </w:pPr>
+            <w:r/>
+            <w:r>
+              <w:rPr>
+                <w:rFonts w:ascii="Arial" w:hAnsi="Arial" w:cs="Arial"/>
+                <w:b w:val="0"/>
+                <w:sz w:val="24"/>
+                <w:u w:val="none"/>
+              </w:rPr>
+              <w:t>${status_kawin}</w:t>
+            </w:r>
+          </w:p>
+        </w:tc>
+      </w:tr>
+      <w:tr>
+        <w:tc>
+          <w:tcPr>
+            <w:tcW w:type="dxa" w:w="2665"/>
+          </w:tcPr>
+          <w:p>
+            <w:pPr>
+              <w:spacing w:after="0" w:before="0" w:line="240" w:lineRule="auto"/>
+            </w:pPr>
+            <w:r/>
+            <w:r>
+              <w:rPr>
+                <w:rFonts w:ascii="Arial" w:hAnsi="Arial" w:cs="Arial"/>
+                <w:b w:val="0"/>
+                <w:sz w:val="24"/>
+                <w:u w:val="none"/>
+              </w:rPr>
               <w:t>Alamat</w:t>
             </w:r>
           </w:p>
@@ -353,155 +699,254 @@
             <w:tcW w:type="dxa" w:w="283"/>
           </w:tcPr>
           <w:p>
+            <w:pPr>
+              <w:spacing w:after="0" w:before="0" w:line="240" w:lineRule="auto"/>
+            </w:pPr>
+            <w:r/>
             <w:r>
+              <w:rPr>
+                <w:rFonts w:ascii="Arial" w:hAnsi="Arial" w:cs="Arial"/>
+                <w:b w:val="0"/>
+                <w:sz w:val="24"/>
+                <w:u w:val="none"/>
+              </w:rPr>
               <w:t>:</w:t>
             </w:r>
           </w:p>
         </w:tc>
         <w:tc>
           <w:tcPr>
-            <w:tcW w:type="dxa" w:w="5669"/>
+            <w:tcW w:type="dxa" w:w="6520"/>
           </w:tcPr>
           <w:p>
+            <w:pPr>
+              <w:spacing w:after="0" w:before="0" w:line="240" w:lineRule="auto"/>
+            </w:pPr>
+            <w:r/>
             <w:r>
-              <w:t>${alamat} RT ${rt}/RW ${rw}, Dusun ${dusun}</w:t>
+              <w:rPr>
+                <w:rFonts w:ascii="Arial" w:hAnsi="Arial" w:cs="Arial"/>
+                <w:b w:val="0"/>
+                <w:sz w:val="24"/>
+                <w:u w:val="none"/>
+              </w:rPr>
+              <w:t>${alamat} RT ${rt}/RW ${rw}, Dusun ${dusun}, Desa Ngadri, Kec. Binangun, Kab. Blitar</w:t>
             </w:r>
           </w:p>
         </w:tc>
       </w:tr>
     </w:tbl>
     <w:p>
+      <w:pPr>
+        <w:spacing w:after="40" w:before="80" w:line="240" w:lineRule="auto"/>
+      </w:pPr>
       <w:r>
         <w:rPr>
-          <w:b w:val="0"/>
-          <w:i w:val="0"/>
-          <w:sz w:val="22"/>
+          <w:rFonts w:ascii="Arial" w:hAnsi="Arial" w:cs="Arial"/>
+          <w:b/>
+          <w:sz w:val="24"/>
           <w:u w:val="none"/>
         </w:rPr>
+        <w:t>ADALAH BENAR :</w:t>
       </w:r>
     </w:p>
     <w:p>
+      <w:pPr>
+        <w:spacing w:after="40" w:before="0" w:line="240" w:lineRule="auto"/>
+        <w:jc w:val="both"/>
+      </w:pPr>
       <w:r>
         <w:rPr>
+          <w:rFonts w:ascii="Arial" w:hAnsi="Arial" w:cs="Arial"/>
           <w:b w:val="0"/>
-          <w:i w:val="0"/>
-          <w:sz w:val="22"/>
+          <w:sz w:val="24"/>
           <w:u w:val="none"/>
         </w:rPr>
-        <w:t>Berdasarkan data yang ada, orang tersebut di atas adalah benar-benar warga Desa ${desa} yang tergolong keluarga TIDAK MAMPU / kurang mampu secara ekonomi, dengan penghasilan rata-rata ${penghasilan} per bulan.</w:t>
+        <w:t>Bahwa nama tersebut di atas adalah benar-benar penduduk Desa Ngadri Kecamatan Binangun Kabupaten Blitar.</w:t>
       </w:r>
     </w:p>
     <w:p>
+      <w:pPr>
+        <w:spacing w:after="40" w:before="0" w:line="240" w:lineRule="auto"/>
+        <w:jc w:val="both"/>
+      </w:pPr>
       <w:r>
         <w:rPr>
+          <w:rFonts w:ascii="Arial" w:hAnsi="Arial" w:cs="Arial"/>
           <w:b w:val="0"/>
-          <w:i w:val="0"/>
-          <w:sz w:val="22"/>
+          <w:sz w:val="24"/>
           <w:u w:val="none"/>
         </w:rPr>
+        <w:t>Bahwa berdasarkan sepengetahuan kami, yang bersangkutan tergolong keluarga kurang mampu / tidak mampu secara ekonomi dengan penghasilan rata-rata ${penghasilan} per bulan.</w:t>
       </w:r>
     </w:p>
     <w:p>
+      <w:pPr>
+        <w:spacing w:after="40" w:before="0" w:line="240" w:lineRule="auto"/>
+        <w:jc w:val="both"/>
+      </w:pPr>
       <w:r>
         <w:rPr>
+          <w:rFonts w:ascii="Arial" w:hAnsi="Arial" w:cs="Arial"/>
           <w:b w:val="0"/>
-          <w:i w:val="0"/>
-          <w:sz w:val="22"/>
+          <w:sz w:val="24"/>
           <w:u w:val="none"/>
         </w:rPr>
-        <w:t>Surat keterangan ini dibuat untuk keperluan: ${keperluan}.</w:t>
+        <w:t>Surat keterangan ini dibuat untuk keperluan : ${keperluan}.</w:t>
       </w:r>
     </w:p>
     <w:p>
+      <w:pPr>
+        <w:spacing w:after="40" w:before="0" w:line="240" w:lineRule="auto"/>
+        <w:jc w:val="both"/>
+      </w:pPr>
       <w:r>
         <w:rPr>
+          <w:rFonts w:ascii="Arial" w:hAnsi="Arial" w:cs="Arial"/>
           <w:b w:val="0"/>
-          <w:i w:val="0"/>
-          <w:sz w:val="22"/>
-          <w:u w:val="none"/>
-        </w:rPr>
-      </w:r>
-    </w:p>
-    <w:p>
-      <w:r>
-        <w:rPr>
-          <w:b w:val="0"/>
-          <w:i w:val="0"/>
-          <w:sz w:val="22"/>
+          <w:sz w:val="24"/>
           <w:u w:val="none"/>
         </w:rPr>
         <w:t>${keterangan_tambahan}</w:t>
       </w:r>
     </w:p>
     <w:p>
+      <w:pPr>
+        <w:spacing w:after="40" w:before="80" w:line="240" w:lineRule="auto"/>
+        <w:jc w:val="both"/>
+      </w:pPr>
       <w:r>
         <w:rPr>
+          <w:rFonts w:ascii="Arial" w:hAnsi="Arial" w:cs="Arial"/>
           <w:b w:val="0"/>
-          <w:i w:val="0"/>
-          <w:sz w:val="22"/>
+          <w:sz w:val="24"/>
           <w:u w:val="none"/>
         </w:rPr>
+        <w:t>Demikian surat keterangan ini dibuat untuk menjadikan periksa, dan dapatnya digunakan sebagaimana mestinya.</w:t>
       </w:r>
     </w:p>
     <w:p>
-      <w:r>
-        <w:rPr>
-          <w:b w:val="0"/>
-          <w:i w:val="0"/>
-          <w:sz w:val="22"/>
-          <w:u w:val="none"/>
-        </w:rPr>
-        <w:t>Demikian surat keterangan ini dibuat dengan sebenarnya, agar dapat dipergunakan sebagaimana mestinya.</w:t>
-      </w:r>
-    </w:p>
-    <w:p>
-      <w:r>
-        <w:rPr>
-          <w:b w:val="0"/>
-          <w:i w:val="0"/>
-          <w:sz w:val="22"/>
-          <w:u w:val="none"/>
-        </w:rPr>
-      </w:r>
+      <w:pPr>
+        <w:spacing w:after="120" w:before="0"/>
+      </w:pPr>
     </w:p>
     <w:tbl>
       <w:tblPr>
         <w:tblW w:type="auto" w:w="0"/>
         <w:tblLook w:firstColumn="1" w:firstRow="1" w:lastColumn="0" w:lastRow="0" w:noHBand="0" w:noVBand="1" w:val="04A0"/>
+        <w:tblBorders>
+          <w:top w:val="none"/>
+          <w:left w:val="none"/>
+          <w:bottom w:val="none"/>
+          <w:right w:val="none"/>
+          <w:insideH w:val="none"/>
+          <w:insideV w:val="none"/>
+        </w:tblBorders>
+        <w:tblCellMar>
+          <w:top w:w="0" w:type="dxa"/>
+          <w:bottom w:w="0" w:type="dxa"/>
+          <w:left w:w="0" w:type="dxa"/>
+          <w:right w:w="80" w:type="dxa"/>
+        </w:tblCellMar>
+        <w:tblCellSpacing w:w="0" w:type="dxa"/>
       </w:tblPr>
       <w:tblGrid>
-        <w:gridCol w:w="4844"/>
-        <w:gridCol w:w="4844"/>
+        <w:gridCol w:w="4901"/>
+        <w:gridCol w:w="4901"/>
       </w:tblGrid>
       <w:tr>
         <w:tc>
           <w:tcPr>
-            <w:tcW w:type="dxa" w:w="4844"/>
+            <w:tcW w:type="dxa" w:w="4819"/>
           </w:tcPr>
           <w:p/>
         </w:tc>
         <w:tc>
           <w:tcPr>
-            <w:tcW w:type="dxa" w:w="4844"/>
+            <w:tcW w:type="dxa" w:w="4819"/>
           </w:tcPr>
           <w:p>
             <w:pPr>
+              <w:spacing w:after="0"/>
               <w:jc w:val="center"/>
             </w:pPr>
             <w:r>
-              <w:t>${desa}, ${tanggal}</w:t>
-              <w:br/>
+              <w:rPr>
+                <w:rFonts w:ascii="Arial" w:hAnsi="Arial" w:cs="Arial"/>
+                <w:b w:val="0"/>
+                <w:sz w:val="24"/>
+                <w:u w:val="none"/>
+              </w:rPr>
+              <w:t>Ngadri, ${tanggal}</w:t>
             </w:r>
-            <w:r>
-              <w:t>${jabatan_ttd}</w:t>
-              <w:br/>
-              <w:br/>
-              <w:br/>
-              <w:br/>
-            </w:r>
+          </w:p>
+          <w:p>
+            <w:pPr>
+              <w:spacing w:after="0"/>
+              <w:jc w:val="center"/>
+            </w:pPr>
             <w:r>
               <w:rPr>
+                <w:rFonts w:ascii="Arial" w:hAnsi="Arial" w:cs="Arial"/>
+                <w:b w:val="0"/>
+                <w:sz w:val="24"/>
+                <w:u w:val="none"/>
+              </w:rPr>
+              <w:t>${jabatan_ttd}</w:t>
+            </w:r>
+          </w:p>
+          <w:p>
+            <w:pPr>
+              <w:spacing w:after="0"/>
+              <w:jc w:val="center"/>
+            </w:pPr>
+            <w:r>
+              <w:rPr>
+                <w:rFonts w:ascii="Arial" w:hAnsi="Arial" w:cs="Arial"/>
+                <w:b w:val="0"/>
+                <w:sz w:val="24"/>
+                <w:u w:val="none"/>
+              </w:rPr>
+            </w:r>
+          </w:p>
+          <w:p>
+            <w:pPr>
+              <w:spacing w:after="0"/>
+              <w:jc w:val="center"/>
+            </w:pPr>
+            <w:r>
+              <w:rPr>
+                <w:rFonts w:ascii="Arial" w:hAnsi="Arial" w:cs="Arial"/>
+                <w:b w:val="0"/>
+                <w:sz w:val="24"/>
+                <w:u w:val="none"/>
+              </w:rPr>
+            </w:r>
+          </w:p>
+          <w:p>
+            <w:pPr>
+              <w:spacing w:after="0"/>
+              <w:jc w:val="center"/>
+            </w:pPr>
+            <w:r>
+              <w:rPr>
+                <w:rFonts w:ascii="Arial" w:hAnsi="Arial" w:cs="Arial"/>
+                <w:b w:val="0"/>
+                <w:sz w:val="24"/>
+                <w:u w:val="none"/>
+              </w:rPr>
+            </w:r>
+          </w:p>
+          <w:p>
+            <w:pPr>
+              <w:spacing w:after="0"/>
+              <w:jc w:val="center"/>
+            </w:pPr>
+            <w:r>
+              <w:rPr>
+                <w:rFonts w:ascii="Arial" w:hAnsi="Arial" w:cs="Arial"/>
                 <w:b/>
+                <w:sz w:val="24"/>
                 <w:u w:val="single"/>
               </w:rPr>
               <w:t>${penandatangan}</w:t>
@@ -512,7 +957,7 @@
     </w:tbl>
     <w:sectPr>
       <w:pgSz w:w="12240" w:h="15840"/>
-      <w:pgMar w:top="850" w:right="1134" w:bottom="850" w:left="1417" w:header="720" w:footer="720" w:gutter="0"/>
+      <w:pgMar w:top="794" w:right="1134" w:bottom="907" w:left="1304" w:header="720" w:footer="720" w:gutter="0"/>
       <w:cols w:space="720"/>
       <w:docGrid w:linePitch="360"/>
     </w:sectPr>
@@ -883,6 +1328,13 @@
     <w:name w:val="Normal"/>
     <w:qFormat/>
     <w:rsid w:val="00FC693F"/>
+    <w:pPr>
+      <w:spacing w:after="0" w:before="0" w:line="240" w:lineRule="auto"/>
+    </w:pPr>
+    <w:rPr>
+      <w:rFonts w:ascii="Arial" w:hAnsi="Arial" w:cs="Arial"/>
+      <w:sz w:val="24"/>
+    </w:rPr>
   </w:style>
   <w:style w:type="paragraph" w:styleId="Header">
     <w:name w:val="header"/>

</xml_diff>